<commit_message>
draft(UNAPPROVED): add terminal periods to FMS.4.b and FMS.4.c requirements
Co-authored-by: upadhyaymehul9-prog <upadhyaymehul9-prog@users.noreply.github.com>
</commit_message>
<xml_diff>
--- a/policies/build/preview/FMS.4_v2_preview.docx
+++ b/policies/build/preview/FMS.4_v2_preview.docx
@@ -3774,7 +3774,7 @@
                 <w:sz w:val="18"/>
                 <w:szCs w:val="18"/>
               </w:rPr>
-              <w:t xml:space="preserve">Medical gases are handled, stored, distributed and used in a safe manner</w:t>
+              <w:t xml:space="preserve">Medical gases are handled, stored, distributed and used in a safe manner.</w:t>
             </w:r>
           </w:p>
         </w:tc>
@@ -3864,7 +3864,7 @@
                 <w:sz w:val="18"/>
                 <w:szCs w:val="18"/>
               </w:rPr>
-              <w:t xml:space="preserve">Alternate sources for medical gases, vacuum and compressed air are provided for, in case of failure and their functioning is tested at a predefined frequency</w:t>
+              <w:t xml:space="preserve">Alternate sources for medical gases, vacuum and compressed air are provided for, in case of failure and their functioning is tested at a predefined frequency.</w:t>
             </w:r>
           </w:p>
         </w:tc>
@@ -4110,7 +4110,7 @@
         <w:spacing w:after="100" w:before="220"/>
       </w:pPr>
       <w:r>
-        <w:t xml:space="preserve">FMS.4.b — Medical gases are handled, stored, distributed and used in a safe manner</w:t>
+        <w:t xml:space="preserve">FMS.4.b — Medical gases are handled, stored, distributed and used in a safe manner.</w:t>
       </w:r>
     </w:p>
     <w:p>
@@ -4170,7 +4170,7 @@
         <w:spacing w:after="100" w:before="220"/>
       </w:pPr>
       <w:r>
-        <w:t xml:space="preserve">FMS.4.c — Alternate sources for medical gases, vacuum and compressed air are provided for, in case of failure and their functioning is tested at a predefined frequency</w:t>
+        <w:t xml:space="preserve">FMS.4.c — Alternate sources for medical gases, vacuum and compressed air are provided for, in case of failure and their functioning is tested at a predefined frequency.</w:t>
       </w:r>
     </w:p>
     <w:p>

</xml_diff>